<commit_message>
docs: actualizar documento de instrucciones de Stripe
</commit_message>
<xml_diff>
--- a/Activacion Stripe para el cliente.docx
+++ b/Activacion Stripe para el cliente.docx
@@ -41,7 +41,6 @@
           <w:numId w:val="1"/>
         </w:numPr>
         <w:tabs>
-          <w:tab w:val="clear" w:pos="709"/>
           <w:tab w:val="left" w:pos="709" w:leader="none"/>
         </w:tabs>
         <w:bidi w:val="0"/>
@@ -68,7 +67,6 @@
           <w:numId w:val="1"/>
         </w:numPr>
         <w:tabs>
-          <w:tab w:val="clear" w:pos="709"/>
           <w:tab w:val="left" w:pos="709" w:leader="none"/>
         </w:tabs>
         <w:bidi w:val="0"/>
@@ -95,7 +93,6 @@
           <w:numId w:val="1"/>
         </w:numPr>
         <w:tabs>
-          <w:tab w:val="clear" w:pos="709"/>
           <w:tab w:val="left" w:pos="709" w:leader="none"/>
         </w:tabs>
         <w:bidi w:val="0"/>
@@ -122,7 +119,6 @@
           <w:numId w:val="1"/>
         </w:numPr>
         <w:tabs>
-          <w:tab w:val="clear" w:pos="709"/>
           <w:tab w:val="left" w:pos="709" w:leader="none"/>
         </w:tabs>
         <w:bidi w:val="0"/>
@@ -165,7 +161,6 @@
           <w:numId w:val="2"/>
         </w:numPr>
         <w:tabs>
-          <w:tab w:val="clear" w:pos="709"/>
           <w:tab w:val="left" w:pos="709" w:leader="none"/>
         </w:tabs>
         <w:bidi w:val="0"/>
@@ -204,7 +199,6 @@
           <w:numId w:val="2"/>
         </w:numPr>
         <w:tabs>
-          <w:tab w:val="clear" w:pos="709"/>
           <w:tab w:val="left" w:pos="709" w:leader="none"/>
         </w:tabs>
         <w:bidi w:val="0"/>
@@ -231,7 +225,6 @@
           <w:numId w:val="2"/>
         </w:numPr>
         <w:tabs>
-          <w:tab w:val="clear" w:pos="709"/>
           <w:tab w:val="left" w:pos="709" w:leader="none"/>
         </w:tabs>
         <w:bidi w:val="0"/>
@@ -258,7 +251,6 @@
           <w:numId w:val="2"/>
         </w:numPr>
         <w:tabs>
-          <w:tab w:val="clear" w:pos="709"/>
           <w:tab w:val="left" w:pos="709" w:leader="none"/>
         </w:tabs>
         <w:bidi w:val="0"/>
@@ -295,7 +287,6 @@
           <w:numId w:val="2"/>
         </w:numPr>
         <w:tabs>
-          <w:tab w:val="clear" w:pos="709"/>
           <w:tab w:val="left" w:pos="709" w:leader="none"/>
         </w:tabs>
         <w:bidi w:val="0"/>
@@ -428,7 +419,6 @@
           <w:numId w:val="2"/>
         </w:numPr>
         <w:tabs>
-          <w:tab w:val="clear" w:pos="709"/>
           <w:tab w:val="left" w:pos="709" w:leader="none"/>
         </w:tabs>
         <w:bidi w:val="0"/>
@@ -473,7 +463,6 @@
           <w:numId w:val="3"/>
         </w:numPr>
         <w:tabs>
-          <w:tab w:val="clear" w:pos="709"/>
           <w:tab w:val="left" w:pos="709" w:leader="none"/>
         </w:tabs>
         <w:bidi w:val="0"/>
@@ -520,7 +509,6 @@
           <w:numId w:val="3"/>
         </w:numPr>
         <w:tabs>
-          <w:tab w:val="clear" w:pos="709"/>
           <w:tab w:val="left" w:pos="709" w:leader="none"/>
         </w:tabs>
         <w:bidi w:val="0"/>
@@ -567,7 +555,6 @@
           <w:numId w:val="3"/>
         </w:numPr>
         <w:tabs>
-          <w:tab w:val="clear" w:pos="709"/>
           <w:tab w:val="left" w:pos="709" w:leader="none"/>
         </w:tabs>
         <w:bidi w:val="0"/>
@@ -604,7 +591,6 @@
           <w:numId w:val="3"/>
         </w:numPr>
         <w:tabs>
-          <w:tab w:val="clear" w:pos="709"/>
           <w:tab w:val="left" w:pos="709" w:leader="none"/>
         </w:tabs>
         <w:bidi w:val="0"/>
@@ -719,23 +705,638 @@
           <w:numId w:val="4"/>
         </w:numPr>
         <w:tabs>
+          <w:tab w:val="left" w:pos="709" w:leader="none"/>
+        </w:tabs>
+        <w:bidi w:val="0"/>
+        <w:ind w:hanging="283" w:start="709"/>
+        <w:jc w:val="start"/>
+        <w:rPr/>
+      </w:pPr>
+      <w:r>
+        <w:rPr/>
+        <w:t xml:space="preserve">Ve al proyecto de tu cliente en Vercel (Ej: </w:t>
+      </w:r>
+      <w:r>
+        <w:rPr>
+          <w:rStyle w:val="Textooriginal"/>
+        </w:rPr>
+        <w:t>pizzeria-roma</w:t>
+      </w:r>
+      <w:r>
+        <w:rPr/>
+        <w:t>).</w:t>
+      </w:r>
+    </w:p>
+    <w:p>
+      <w:pPr>
+        <w:pStyle w:val="BodyText"/>
+        <w:numPr>
+          <w:ilvl w:val="0"/>
+          <w:numId w:val="4"/>
+        </w:numPr>
+        <w:tabs>
+          <w:tab w:val="left" w:pos="709" w:leader="none"/>
+        </w:tabs>
+        <w:bidi w:val="0"/>
+        <w:ind w:hanging="283" w:start="709"/>
+        <w:jc w:val="start"/>
+        <w:rPr/>
+      </w:pPr>
+      <w:r>
+        <w:rPr/>
+        <w:t xml:space="preserve">Navega a </w:t>
+      </w:r>
+      <w:r>
+        <w:rPr>
+          <w:b/>
+        </w:rPr>
+        <w:t>Settings &gt; Environment Variables</w:t>
+      </w:r>
+      <w:r>
+        <w:rPr/>
+        <w:t>.</w:t>
+      </w:r>
+    </w:p>
+    <w:p>
+      <w:pPr>
+        <w:pStyle w:val="BodyText"/>
+        <w:numPr>
+          <w:ilvl w:val="0"/>
+          <w:numId w:val="4"/>
+        </w:numPr>
+        <w:tabs>
+          <w:tab w:val="left" w:pos="709" w:leader="none"/>
+        </w:tabs>
+        <w:bidi w:val="0"/>
+        <w:ind w:hanging="283" w:start="709"/>
+        <w:jc w:val="start"/>
+        <w:rPr/>
+      </w:pPr>
+      <w:r>
+        <w:rPr/>
+        <w:t>Pega la clave pública (</w:t>
+      </w:r>
+      <w:r>
+        <w:rPr>
+          <w:rStyle w:val="Textooriginal"/>
+        </w:rPr>
+        <w:t>pk_live_...</w:t>
+      </w:r>
+      <w:r>
+        <w:rPr/>
+        <w:t xml:space="preserve">) en tu variable de entorno (por ejemplo, </w:t>
+      </w:r>
+      <w:r>
+        <w:rPr>
+          <w:rStyle w:val="Textooriginal"/>
+        </w:rPr>
+        <w:t>VITE_STRIPE_PUBLIC_KEY</w:t>
+      </w:r>
+      <w:r>
+        <w:rPr/>
+        <w:t>).</w:t>
+      </w:r>
+    </w:p>
+    <w:p>
+      <w:pPr>
+        <w:pStyle w:val="BodyText"/>
+        <w:numPr>
+          <w:ilvl w:val="0"/>
+          <w:numId w:val="4"/>
+        </w:numPr>
+        <w:tabs>
+          <w:tab w:val="left" w:pos="709" w:leader="none"/>
+        </w:tabs>
+        <w:bidi w:val="0"/>
+        <w:ind w:hanging="283" w:start="709"/>
+        <w:jc w:val="start"/>
+        <w:rPr/>
+      </w:pPr>
+      <w:r>
+        <w:rPr/>
+        <w:t>Pega la clave secreta (</w:t>
+      </w:r>
+      <w:r>
+        <w:rPr>
+          <w:rStyle w:val="Textooriginal"/>
+        </w:rPr>
+        <w:t>sk_live_...</w:t>
+      </w:r>
+      <w:r>
+        <w:rPr/>
+        <w:t xml:space="preserve">) en tu variable de entorno (por ejemplo, </w:t>
+      </w:r>
+      <w:r>
+        <w:rPr>
+          <w:rStyle w:val="Textooriginal"/>
+        </w:rPr>
+        <w:t>STRIPE_SECRET_KEY</w:t>
+      </w:r>
+      <w:r>
+        <w:rPr/>
+        <w:t>).</w:t>
+      </w:r>
+    </w:p>
+    <w:p>
+      <w:pPr>
+        <w:pStyle w:val="BodyText"/>
+        <w:numPr>
+          <w:ilvl w:val="0"/>
+          <w:numId w:val="4"/>
+        </w:numPr>
+        <w:tabs>
+          <w:tab w:val="left" w:pos="709" w:leader="none"/>
+        </w:tabs>
+        <w:bidi w:val="0"/>
+        <w:ind w:hanging="283" w:start="709"/>
+        <w:jc w:val="start"/>
+        <w:rPr/>
+      </w:pPr>
+      <w:r>
+        <w:rPr/>
+        <w:t xml:space="preserve">Guarda los cambios y haz un </w:t>
+      </w:r>
+      <w:r>
+        <w:rPr>
+          <w:b/>
+        </w:rPr>
+        <w:t>Redeploy</w:t>
+      </w:r>
+      <w:r>
+        <w:rPr/>
+        <w:t xml:space="preserve"> desde la pestaña </w:t>
+      </w:r>
+      <w:r>
+        <w:rPr>
+          <w:i/>
+        </w:rPr>
+        <w:t>Deployments</w:t>
+      </w:r>
+      <w:r>
+        <w:rPr/>
+        <w:t>.</w:t>
+      </w:r>
+    </w:p>
+    <w:p>
+      <w:pPr>
+        <w:pStyle w:val="Normal"/>
+        <w:bidi w:val="0"/>
+        <w:jc w:val="start"/>
+        <w:rPr/>
+      </w:pPr>
+      <w:r>
+        <w:rPr/>
+        <w:t>___________________</w:t>
+      </w:r>
+    </w:p>
+    <w:p>
+      <w:pPr>
+        <w:pStyle w:val="Normal"/>
+        <w:bidi w:val="0"/>
+        <w:jc w:val="start"/>
+        <w:rPr/>
+      </w:pPr>
+      <w:r>
+        <w:rPr/>
+        <w:br/>
+        <w:t>PARA EL CLIENTE</w:t>
+        <w:br/>
+      </w:r>
+      <w:r>
+        <w:rPr/>
+        <w:t>Guía Paso a Paso: Configuración de Pagos (Stripe) para tu Restaurante</w:t>
+      </w:r>
+    </w:p>
+    <w:p>
+      <w:pPr>
+        <w:pStyle w:val="BodyText"/>
+        <w:rPr/>
+      </w:pPr>
+      <w:r>
+        <w:rPr/>
+        <w:t xml:space="preserve">Para que el dinero de los pedidos online vaya directamente de la tarjeta de tus clientes a la cuenta bancaria de tu restaurante, utilizamos </w:t>
+      </w:r>
+      <w:r>
+        <w:rPr>
+          <w:b/>
+        </w:rPr>
+        <w:t>Stripe</w:t>
+      </w:r>
+      <w:r>
+        <w:rPr/>
+        <w:t xml:space="preserve"> (la plataforma de pagos más segura del mundo, usada por empresas como Amazon o Booking).</w:t>
+      </w:r>
+    </w:p>
+    <w:p>
+      <w:pPr>
+        <w:pStyle w:val="BodyText"/>
+        <w:rPr/>
+      </w:pPr>
+      <w:r>
+        <w:rPr/>
+        <w:t>Por ley de protección y prevención de fraudes, debes crear esta cuenta tú mismo a tu nombre. Te llevará unos 10 minutos.</w:t>
+      </w:r>
+    </w:p>
+    <w:p>
+      <w:pPr>
+        <w:pStyle w:val="Heading3"/>
+        <w:rPr/>
+      </w:pPr>
+      <w:r>
+        <w:rPr/>
+        <w:t>FASE 1: Lo que necesitas tener a mano antes de empezar</w:t>
+      </w:r>
+    </w:p>
+    <w:p>
+      <w:pPr>
+        <w:pStyle w:val="BodyText"/>
+        <w:rPr/>
+      </w:pPr>
+      <w:r>
+        <w:rPr/>
+        <w:t>Por favor, prepara esto sobre la mesa antes de hacer clic en ningún enlace:</w:t>
+      </w:r>
+    </w:p>
+    <w:p>
+      <w:pPr>
+        <w:pStyle w:val="BodyText"/>
+        <w:numPr>
+          <w:ilvl w:val="0"/>
+          <w:numId w:val="5"/>
+        </w:numPr>
+        <w:tabs>
           <w:tab w:val="clear" w:pos="709"/>
-          <w:tab w:val="left" w:pos="709" w:leader="none"/>
-        </w:tabs>
-        <w:bidi w:val="0"/>
-        <w:ind w:hanging="283" w:start="709"/>
-        <w:jc w:val="start"/>
-        <w:rPr/>
-      </w:pPr>
-      <w:r>
-        <w:rPr/>
-        <w:t xml:space="preserve">Ve al proyecto de tu cliente en Vercel (Ej: </w:t>
+          <w:tab w:val="left" w:pos="0" w:leader="none"/>
+        </w:tabs>
+        <w:ind w:hanging="283" w:start="709"/>
+        <w:rPr/>
+      </w:pPr>
+      <w:r>
+        <w:rPr>
+          <w:b/>
+        </w:rPr>
+        <w:t>Tu DNI o NIE original</w:t>
+      </w:r>
+      <w:r>
+        <w:rPr/>
+        <w:t xml:space="preserve"> (físico, te pedirán hacerle una foto).</w:t>
+      </w:r>
+    </w:p>
+    <w:p>
+      <w:pPr>
+        <w:pStyle w:val="BodyText"/>
+        <w:numPr>
+          <w:ilvl w:val="0"/>
+          <w:numId w:val="5"/>
+        </w:numPr>
+        <w:tabs>
+          <w:tab w:val="clear" w:pos="709"/>
+          <w:tab w:val="left" w:pos="0" w:leader="none"/>
+        </w:tabs>
+        <w:ind w:hanging="283" w:start="709"/>
+        <w:rPr/>
+      </w:pPr>
+      <w:r>
+        <w:rPr>
+          <w:b/>
+        </w:rPr>
+        <w:t>Tu teléfono móvil</w:t>
+      </w:r>
+      <w:r>
+        <w:rPr/>
+        <w:t xml:space="preserve"> (con cámara para la verificación).</w:t>
+      </w:r>
+    </w:p>
+    <w:p>
+      <w:pPr>
+        <w:pStyle w:val="BodyText"/>
+        <w:numPr>
+          <w:ilvl w:val="0"/>
+          <w:numId w:val="5"/>
+        </w:numPr>
+        <w:tabs>
+          <w:tab w:val="clear" w:pos="709"/>
+          <w:tab w:val="left" w:pos="0" w:leader="none"/>
+        </w:tabs>
+        <w:ind w:hanging="283" w:start="709"/>
+        <w:rPr/>
+      </w:pPr>
+      <w:r>
+        <w:rPr>
+          <w:b/>
+        </w:rPr>
+        <w:t>El CIF de tu empresa</w:t>
+      </w:r>
+      <w:r>
+        <w:rPr/>
+        <w:t xml:space="preserve"> (o tu DNI si eres autónomo) y la dirección del local.</w:t>
+      </w:r>
+    </w:p>
+    <w:p>
+      <w:pPr>
+        <w:pStyle w:val="BodyText"/>
+        <w:numPr>
+          <w:ilvl w:val="0"/>
+          <w:numId w:val="5"/>
+        </w:numPr>
+        <w:tabs>
+          <w:tab w:val="clear" w:pos="709"/>
+          <w:tab w:val="left" w:pos="0" w:leader="none"/>
+        </w:tabs>
+        <w:ind w:hanging="283" w:start="709"/>
+        <w:rPr/>
+      </w:pPr>
+      <w:r>
+        <w:rPr>
+          <w:b/>
+        </w:rPr>
+        <w:t>El número de cuenta bancaria (IBAN)</w:t>
+      </w:r>
+      <w:r>
+        <w:rPr/>
+        <w:t xml:space="preserve"> donde quieres recibir el dinero de las ventas.</w:t>
+      </w:r>
+    </w:p>
+    <w:p>
+      <w:pPr>
+        <w:pStyle w:val="Heading3"/>
+        <w:rPr/>
+      </w:pPr>
+      <w:r>
+        <w:rPr/>
+        <w:t>FASE 2: Crear y Activar tu Cuenta</w:t>
+      </w:r>
+    </w:p>
+    <w:p>
+      <w:pPr>
+        <w:pStyle w:val="BodyText"/>
+        <w:numPr>
+          <w:ilvl w:val="0"/>
+          <w:numId w:val="6"/>
+        </w:numPr>
+        <w:tabs>
+          <w:tab w:val="clear" w:pos="709"/>
+          <w:tab w:val="left" w:pos="0" w:leader="none"/>
+        </w:tabs>
+        <w:ind w:hanging="283" w:start="709"/>
+        <w:rPr/>
+      </w:pPr>
+      <w:r>
+        <w:rPr/>
+        <w:t xml:space="preserve">Entra desde un ordenador a la web oficial de registro: </w:t>
+      </w:r>
+      <w:hyperlink r:id="rId3" w:tgtFrame="_blank">
+        <w:r>
+          <w:rPr>
+            <w:rStyle w:val="Hyperlink"/>
+            <w:b/>
+          </w:rPr>
+          <w:t>https://dashboard.stripe.com/register</w:t>
+        </w:r>
+      </w:hyperlink>
+    </w:p>
+    <w:p>
+      <w:pPr>
+        <w:pStyle w:val="BodyText"/>
+        <w:numPr>
+          <w:ilvl w:val="0"/>
+          <w:numId w:val="6"/>
+        </w:numPr>
+        <w:tabs>
+          <w:tab w:val="clear" w:pos="709"/>
+          <w:tab w:val="left" w:pos="0" w:leader="none"/>
+        </w:tabs>
+        <w:ind w:hanging="283" w:start="709"/>
+        <w:rPr/>
+      </w:pPr>
+      <w:r>
+        <w:rPr/>
+        <w:t>Rellena el formulario inicial con tu nombre, el email del restaurante y crea una contraseña.</w:t>
+      </w:r>
+    </w:p>
+    <w:p>
+      <w:pPr>
+        <w:pStyle w:val="BodyText"/>
+        <w:numPr>
+          <w:ilvl w:val="0"/>
+          <w:numId w:val="6"/>
+        </w:numPr>
+        <w:tabs>
+          <w:tab w:val="clear" w:pos="709"/>
+          <w:tab w:val="left" w:pos="0" w:leader="none"/>
+        </w:tabs>
+        <w:ind w:hanging="283" w:start="709"/>
+        <w:rPr/>
+      </w:pPr>
+      <w:r>
+        <w:rPr/>
+        <w:t xml:space="preserve">Ve a tu correo electrónico, abre el mensaje de Stripe y haz clic en el botón para </w:t>
+      </w:r>
+      <w:r>
+        <w:rPr>
+          <w:b/>
+        </w:rPr>
+        <w:t>Verificar tu email</w:t>
+      </w:r>
+      <w:r>
+        <w:rPr/>
+        <w:t>.</w:t>
+      </w:r>
+    </w:p>
+    <w:p>
+      <w:pPr>
+        <w:pStyle w:val="BodyText"/>
+        <w:numPr>
+          <w:ilvl w:val="0"/>
+          <w:numId w:val="6"/>
+        </w:numPr>
+        <w:tabs>
+          <w:tab w:val="clear" w:pos="709"/>
+          <w:tab w:val="left" w:pos="0" w:leader="none"/>
+        </w:tabs>
+        <w:ind w:hanging="283" w:start="709"/>
+        <w:rPr/>
+      </w:pPr>
+      <w:r>
+        <w:rPr/>
+        <w:t xml:space="preserve">Al volver a la pantalla de Stripe, verás un botón destacado que dice </w:t>
+      </w:r>
+      <w:r>
+        <w:rPr>
+          <w:b/>
+        </w:rPr>
+        <w:t>"Activar pagos"</w:t>
+      </w:r>
+      <w:r>
+        <w:rPr/>
+        <w:t xml:space="preserve"> (o "Activate payments"). Haz clic en él.</w:t>
+      </w:r>
+    </w:p>
+    <w:p>
+      <w:pPr>
+        <w:pStyle w:val="BodyText"/>
+        <w:numPr>
+          <w:ilvl w:val="0"/>
+          <w:numId w:val="6"/>
+        </w:numPr>
+        <w:tabs>
+          <w:tab w:val="clear" w:pos="709"/>
+          <w:tab w:val="left" w:pos="0" w:leader="none"/>
+        </w:tabs>
+        <w:ind w:hanging="283" w:start="709"/>
+        <w:rPr/>
+      </w:pPr>
+      <w:r>
+        <w:rPr/>
+        <w:t>Sigue los pasos de la pantalla. Te preguntarán qué tipo de empresa eres y a qué te dedicas (Restauración).</w:t>
+      </w:r>
+    </w:p>
+    <w:p>
+      <w:pPr>
+        <w:pStyle w:val="BodyText"/>
+        <w:numPr>
+          <w:ilvl w:val="0"/>
+          <w:numId w:val="6"/>
+        </w:numPr>
+        <w:tabs>
+          <w:tab w:val="clear" w:pos="709"/>
+          <w:tab w:val="left" w:pos="0" w:leader="none"/>
+        </w:tabs>
+        <w:ind w:hanging="283" w:start="709"/>
+        <w:rPr/>
+      </w:pPr>
+      <w:r>
+        <w:rPr/>
+        <w:t xml:space="preserve">Llegará un punto donde te pedirán </w:t>
+      </w:r>
+      <w:r>
+        <w:rPr>
+          <w:b/>
+        </w:rPr>
+        <w:t>Verificar tu identidad</w:t>
+      </w:r>
+      <w:r>
+        <w:rPr/>
+        <w:t>. Te mostrarán un código QR en la pantalla del ordenador. Escanéalo con tu móvil para hacerle una foto a tu DNI (por delante y por detrás).</w:t>
+      </w:r>
+    </w:p>
+    <w:p>
+      <w:pPr>
+        <w:pStyle w:val="BodyText"/>
+        <w:numPr>
+          <w:ilvl w:val="0"/>
+          <w:numId w:val="6"/>
+        </w:numPr>
+        <w:tabs>
+          <w:tab w:val="clear" w:pos="709"/>
+          <w:tab w:val="left" w:pos="0" w:leader="none"/>
+        </w:tabs>
+        <w:ind w:hanging="283" w:start="709"/>
+        <w:rPr/>
+      </w:pPr>
+      <w:r>
+        <w:rPr/>
+        <w:t>Introduce tu número de cuenta bancaria (IBAN) y finaliza el proceso.</w:t>
+      </w:r>
+    </w:p>
+    <w:p>
+      <w:pPr>
+        <w:pStyle w:val="Heading3"/>
+        <w:rPr/>
+      </w:pPr>
+      <w:r>
+        <w:rPr/>
+        <w:t>FASE 3: Obtener las Claves de Conexión (¡Importante!)</w:t>
+      </w:r>
+    </w:p>
+    <w:p>
+      <w:pPr>
+        <w:pStyle w:val="BodyText"/>
+        <w:rPr/>
+      </w:pPr>
+      <w:r>
+        <w:rPr/>
+        <w:t>Una vez tu cuenta esté activa y verificada, necesitamos conectar tu Stripe con tu nueva página web. Para ello, debes enviarnos dos "Claves". Sigue estos pasos con mucho cuidado:</w:t>
+      </w:r>
+    </w:p>
+    <w:p>
+      <w:pPr>
+        <w:pStyle w:val="BodyText"/>
+        <w:numPr>
+          <w:ilvl w:val="0"/>
+          <w:numId w:val="7"/>
+        </w:numPr>
+        <w:tabs>
+          <w:tab w:val="clear" w:pos="709"/>
+          <w:tab w:val="left" w:pos="0" w:leader="none"/>
+        </w:tabs>
+        <w:ind w:hanging="283" w:start="709"/>
+        <w:rPr/>
+      </w:pPr>
+      <w:r>
+        <w:rPr/>
+        <w:t xml:space="preserve">En la página principal de Stripe, arriba a la derecha, verás un interruptor que dice </w:t>
+      </w:r>
+      <w:r>
+        <w:rPr>
+          <w:b/>
+        </w:rPr>
+        <w:t>"Modo de prueba" (Test mode)</w:t>
+      </w:r>
+      <w:r>
+        <w:rPr/>
+        <w:t xml:space="preserve">. </w:t>
+      </w:r>
+      <w:r>
+        <w:rPr>
+          <w:b/>
+        </w:rPr>
+        <w:t>Asegúrate de que está APAGADO.</w:t>
+      </w:r>
+      <w:r>
+        <w:rPr/>
+        <w:t xml:space="preserve"> </w:t>
+      </w:r>
+      <w:r>
+        <w:rPr>
+          <w:i/>
+        </w:rPr>
+        <w:t>(Es vital para que el dinero sea real).</w:t>
+      </w:r>
+    </w:p>
+    <w:p>
+      <w:pPr>
+        <w:pStyle w:val="BodyText"/>
+        <w:numPr>
+          <w:ilvl w:val="0"/>
+          <w:numId w:val="7"/>
+        </w:numPr>
+        <w:tabs>
+          <w:tab w:val="clear" w:pos="709"/>
+          <w:tab w:val="left" w:pos="0" w:leader="none"/>
+        </w:tabs>
+        <w:ind w:hanging="283" w:start="709"/>
+        <w:rPr/>
+      </w:pPr>
+      <w:r>
+        <w:rPr/>
+        <w:t xml:space="preserve">Justo al lado, arriba a la derecha, haz clic en el botón que dice </w:t>
+      </w:r>
+      <w:r>
+        <w:rPr>
+          <w:b/>
+        </w:rPr>
+        <w:t>"Desarrolladores"</w:t>
+      </w:r>
+      <w:r>
+        <w:rPr/>
+        <w:t xml:space="preserve"> (a veces tiene el símbolo </w:t>
       </w:r>
       <w:r>
         <w:rPr>
           <w:rStyle w:val="Textooriginal"/>
         </w:rPr>
-        <w:t>pizzeria-roma</w:t>
+        <w:t>&lt; &gt;</w:t>
       </w:r>
       <w:r>
         <w:rPr/>
@@ -747,26 +1348,24 @@
         <w:pStyle w:val="BodyText"/>
         <w:numPr>
           <w:ilvl w:val="0"/>
-          <w:numId w:val="4"/>
+          <w:numId w:val="7"/>
         </w:numPr>
         <w:tabs>
           <w:tab w:val="clear" w:pos="709"/>
-          <w:tab w:val="left" w:pos="709" w:leader="none"/>
-        </w:tabs>
-        <w:bidi w:val="0"/>
-        <w:ind w:hanging="283" w:start="709"/>
-        <w:jc w:val="start"/>
-        <w:rPr/>
-      </w:pPr>
-      <w:r>
-        <w:rPr/>
-        <w:t xml:space="preserve">Navega a </w:t>
-      </w:r>
-      <w:r>
-        <w:rPr>
-          <w:b/>
-        </w:rPr>
-        <w:t>Settings &gt; Environment Variables</w:t>
+          <w:tab w:val="left" w:pos="0" w:leader="none"/>
+        </w:tabs>
+        <w:ind w:hanging="283" w:start="709"/>
+        <w:rPr/>
+      </w:pPr>
+      <w:r>
+        <w:rPr/>
+        <w:t xml:space="preserve">En el menú que aparecerá a la izquierda, haz clic en </w:t>
+      </w:r>
+      <w:r>
+        <w:rPr>
+          <w:b/>
+        </w:rPr>
+        <w:t>"Claves API"</w:t>
       </w:r>
       <w:r>
         <w:rPr/>
@@ -778,122 +1377,155 @@
         <w:pStyle w:val="BodyText"/>
         <w:numPr>
           <w:ilvl w:val="0"/>
-          <w:numId w:val="4"/>
+          <w:numId w:val="7"/>
         </w:numPr>
         <w:tabs>
           <w:tab w:val="clear" w:pos="709"/>
-          <w:tab w:val="left" w:pos="709" w:leader="none"/>
-        </w:tabs>
-        <w:bidi w:val="0"/>
-        <w:ind w:hanging="283" w:start="709"/>
-        <w:jc w:val="start"/>
-        <w:rPr/>
-      </w:pPr>
-      <w:r>
-        <w:rPr/>
-        <w:t>Pega la clave pública (</w:t>
+          <w:tab w:val="left" w:pos="0" w:leader="none"/>
+        </w:tabs>
+        <w:ind w:hanging="283" w:start="709"/>
+        <w:rPr/>
+      </w:pPr>
+      <w:r>
+        <w:rPr/>
+        <w:t>En la pantalla verás dos códigos largos que necesitamos que nos copies:</w:t>
+      </w:r>
+    </w:p>
+    <w:p>
+      <w:pPr>
+        <w:pStyle w:val="BodyText"/>
+        <w:numPr>
+          <w:ilvl w:val="1"/>
+          <w:numId w:val="7"/>
+        </w:numPr>
+        <w:tabs>
+          <w:tab w:val="clear" w:pos="709"/>
+          <w:tab w:val="left" w:pos="0" w:leader="none"/>
+        </w:tabs>
+        <w:ind w:hanging="283" w:start="1418"/>
+        <w:rPr/>
+      </w:pPr>
+      <w:r>
+        <w:rPr>
+          <w:b/>
+        </w:rPr>
+        <w:t>Clave pública:</w:t>
+      </w:r>
+      <w:r>
+        <w:rPr/>
+        <w:t xml:space="preserve"> Es un código que empieza obligatoriamente por </w:t>
       </w:r>
       <w:r>
         <w:rPr>
           <w:rStyle w:val="Textooriginal"/>
-        </w:rPr>
-        <w:t>pk_live_...</w:t>
-      </w:r>
-      <w:r>
-        <w:rPr/>
-        <w:t xml:space="preserve">) en tu variable de entorno (por ejemplo, </w:t>
+          <w:b/>
+        </w:rPr>
+        <w:t>pk_live_</w:t>
+      </w:r>
+      <w:r>
+        <w:rPr/>
+        <w:t xml:space="preserve"> (Si empieza por </w:t>
       </w:r>
       <w:r>
         <w:rPr>
           <w:rStyle w:val="Textooriginal"/>
         </w:rPr>
-        <w:t>VITE_STRIPE_PUBLIC_KEY</w:t>
-      </w:r>
-      <w:r>
-        <w:rPr/>
-        <w:t>).</w:t>
-      </w:r>
-    </w:p>
-    <w:p>
-      <w:pPr>
-        <w:pStyle w:val="BodyText"/>
-        <w:numPr>
-          <w:ilvl w:val="0"/>
-          <w:numId w:val="4"/>
+        <w:t>pk_test</w:t>
+      </w:r>
+      <w:r>
+        <w:rPr/>
+        <w:t>, el Modo Prueba sigue encendido. Apágalo).</w:t>
+      </w:r>
+    </w:p>
+    <w:p>
+      <w:pPr>
+        <w:pStyle w:val="BodyText"/>
+        <w:numPr>
+          <w:ilvl w:val="1"/>
+          <w:numId w:val="7"/>
         </w:numPr>
         <w:tabs>
           <w:tab w:val="clear" w:pos="709"/>
-          <w:tab w:val="left" w:pos="709" w:leader="none"/>
-        </w:tabs>
-        <w:bidi w:val="0"/>
-        <w:ind w:hanging="283" w:start="709"/>
-        <w:jc w:val="start"/>
-        <w:rPr/>
-      </w:pPr>
-      <w:r>
-        <w:rPr/>
-        <w:t>Pega la clave secreta (</w:t>
+          <w:tab w:val="left" w:pos="0" w:leader="none"/>
+        </w:tabs>
+        <w:ind w:hanging="283" w:start="1418"/>
+        <w:rPr/>
+      </w:pPr>
+      <w:r>
+        <w:rPr>
+          <w:b/>
+        </w:rPr>
+        <w:t>Clave secreta:</w:t>
+      </w:r>
+      <w:r>
+        <w:rPr/>
+        <w:t xml:space="preserve"> Está justo debajo y empieza por </w:t>
       </w:r>
       <w:r>
         <w:rPr>
           <w:rStyle w:val="Textooriginal"/>
-        </w:rPr>
-        <w:t>sk_live_...</w:t>
-      </w:r>
-      <w:r>
-        <w:rPr/>
-        <w:t xml:space="preserve">) en tu variable de entorno (por ejemplo, </w:t>
-      </w:r>
-      <w:r>
-        <w:rPr>
-          <w:rStyle w:val="Textooriginal"/>
-        </w:rPr>
-        <w:t>STRIPE_SECRET_KEY</w:t>
-      </w:r>
-      <w:r>
-        <w:rPr/>
-        <w:t>).</w:t>
-      </w:r>
-    </w:p>
-    <w:p>
-      <w:pPr>
-        <w:pStyle w:val="BodyText"/>
-        <w:numPr>
-          <w:ilvl w:val="0"/>
-          <w:numId w:val="4"/>
+          <w:b/>
+        </w:rPr>
+        <w:t>sk_live_</w:t>
+      </w:r>
+      <w:r>
+        <w:rPr/>
+        <w:t>. Estará oculta por seguridad; haz clic en el botón "Revelar clave" para poder verla.</w:t>
+      </w:r>
+    </w:p>
+    <w:p>
+      <w:pPr>
+        <w:pStyle w:val="Heading3"/>
+        <w:rPr/>
+      </w:pPr>
+      <w:r>
+        <w:rPr/>
+        <w:t>FASE 4: Envío de las Claves</w:t>
+      </w:r>
+    </w:p>
+    <w:p>
+      <w:pPr>
+        <w:pStyle w:val="BodyText"/>
+        <w:rPr/>
+      </w:pPr>
+      <w:r>
+        <w:rPr/>
+        <w:t>Copia ambos códigos y envíanoslos por email o WhatsApp.</w:t>
+      </w:r>
+    </w:p>
+    <w:p>
+      <w:pPr>
+        <w:pStyle w:val="BodyText"/>
+        <w:numPr>
+          <w:ilvl w:val="0"/>
+          <w:numId w:val="8"/>
         </w:numPr>
         <w:tabs>
           <w:tab w:val="clear" w:pos="709"/>
-          <w:tab w:val="left" w:pos="709" w:leader="none"/>
-        </w:tabs>
-        <w:bidi w:val="0"/>
-        <w:ind w:hanging="283" w:start="709"/>
-        <w:jc w:val="start"/>
-        <w:rPr/>
-      </w:pPr>
-      <w:r>
-        <w:rPr/>
-        <w:t xml:space="preserve">Guarda los cambios y haz un </w:t>
-      </w:r>
-      <w:r>
-        <w:rPr>
-          <w:b/>
-        </w:rPr>
-        <w:t>Redeploy</w:t>
-      </w:r>
-      <w:r>
-        <w:rPr/>
-        <w:t xml:space="preserve"> desde la pestaña </w:t>
-      </w:r>
-      <w:r>
-        <w:rPr>
-          <w:i/>
-        </w:rPr>
-        <w:t>Deployments</w:t>
-      </w:r>
-      <w:r>
-        <w:rPr/>
-        <w:t>.</w:t>
+          <w:tab w:val="left" w:pos="0" w:leader="none"/>
+        </w:tabs>
+        <w:ind w:hanging="283" w:start="709"/>
+        <w:rPr/>
+      </w:pPr>
+      <w:r>
+        <w:rPr>
+          <w:b/>
+        </w:rPr>
+        <w:t>Atención:</w:t>
+      </w:r>
+      <w:r>
+        <w:rPr/>
+        <w:t xml:space="preserve"> Al seleccionarlos con el ratón, asegúrate de no copiar espacios en blanco al principio ni al final del texto, ya que la conexión fallaría.</w:t>
+      </w:r>
+    </w:p>
+    <w:p>
+      <w:pPr>
+        <w:pStyle w:val="BodyText"/>
+        <w:rPr/>
+      </w:pPr>
+      <w:r>
+        <w:rPr/>
+        <w:t>Una vez nos envíes estas dos claves, nosotros nos encargamos de inyectarlas en tu web y la pasarela de pagos quedará 100% operativa.</w:t>
       </w:r>
     </w:p>
     <w:p>
@@ -914,6 +1546,7 @@
       <w:pgNumType w:fmt="decimal"/>
       <w:formProt w:val="false"/>
       <w:textDirection w:val="lrTb"/>
+      <w:docGrid w:type="default" w:linePitch="100" w:charSpace="0"/>
     </w:sectPr>
   </w:body>
 </w:document>
@@ -1450,6 +2083,534 @@
   <w:abstractNum w:abstractNumId="5">
     <w:lvl w:ilvl="0">
       <w:start w:val="1"/>
+      <w:numFmt w:val="bullet"/>
+      <w:lvlText w:val=""/>
+      <w:lvlJc w:val="start"/>
+      <w:pPr>
+        <w:tabs>
+          <w:tab w:val="num" w:pos="709"/>
+        </w:tabs>
+        <w:ind w:start="709" w:hanging="283"/>
+      </w:pPr>
+      <w:rPr>
+        <w:rFonts w:ascii="Symbol" w:hAnsi="Symbol" w:cs="Symbol" w:hint="default"/>
+      </w:rPr>
+    </w:lvl>
+    <w:lvl w:ilvl="1">
+      <w:start w:val="1"/>
+      <w:numFmt w:val="bullet"/>
+      <w:lvlText w:val=""/>
+      <w:lvlJc w:val="start"/>
+      <w:pPr>
+        <w:tabs>
+          <w:tab w:val="num" w:pos="1418"/>
+        </w:tabs>
+        <w:ind w:start="1418" w:hanging="283"/>
+      </w:pPr>
+      <w:rPr>
+        <w:rFonts w:ascii="Symbol" w:hAnsi="Symbol" w:cs="Symbol" w:hint="default"/>
+      </w:rPr>
+    </w:lvl>
+    <w:lvl w:ilvl="2">
+      <w:start w:val="1"/>
+      <w:numFmt w:val="bullet"/>
+      <w:lvlText w:val=""/>
+      <w:lvlJc w:val="start"/>
+      <w:pPr>
+        <w:tabs>
+          <w:tab w:val="num" w:pos="2127"/>
+        </w:tabs>
+        <w:ind w:start="2127" w:hanging="283"/>
+      </w:pPr>
+      <w:rPr>
+        <w:rFonts w:ascii="Symbol" w:hAnsi="Symbol" w:cs="Symbol" w:hint="default"/>
+      </w:rPr>
+    </w:lvl>
+    <w:lvl w:ilvl="3">
+      <w:start w:val="1"/>
+      <w:numFmt w:val="bullet"/>
+      <w:lvlText w:val=""/>
+      <w:lvlJc w:val="start"/>
+      <w:pPr>
+        <w:tabs>
+          <w:tab w:val="num" w:pos="2836"/>
+        </w:tabs>
+        <w:ind w:start="2836" w:hanging="283"/>
+      </w:pPr>
+      <w:rPr>
+        <w:rFonts w:ascii="Symbol" w:hAnsi="Symbol" w:cs="Symbol" w:hint="default"/>
+      </w:rPr>
+    </w:lvl>
+    <w:lvl w:ilvl="4">
+      <w:start w:val="1"/>
+      <w:numFmt w:val="bullet"/>
+      <w:lvlText w:val=""/>
+      <w:lvlJc w:val="start"/>
+      <w:pPr>
+        <w:tabs>
+          <w:tab w:val="num" w:pos="3545"/>
+        </w:tabs>
+        <w:ind w:start="3545" w:hanging="283"/>
+      </w:pPr>
+      <w:rPr>
+        <w:rFonts w:ascii="Symbol" w:hAnsi="Symbol" w:cs="Symbol" w:hint="default"/>
+      </w:rPr>
+    </w:lvl>
+    <w:lvl w:ilvl="5">
+      <w:start w:val="1"/>
+      <w:numFmt w:val="bullet"/>
+      <w:lvlText w:val=""/>
+      <w:lvlJc w:val="start"/>
+      <w:pPr>
+        <w:tabs>
+          <w:tab w:val="num" w:pos="4254"/>
+        </w:tabs>
+        <w:ind w:start="4254" w:hanging="283"/>
+      </w:pPr>
+      <w:rPr>
+        <w:rFonts w:ascii="Symbol" w:hAnsi="Symbol" w:cs="Symbol" w:hint="default"/>
+      </w:rPr>
+    </w:lvl>
+    <w:lvl w:ilvl="6">
+      <w:start w:val="1"/>
+      <w:numFmt w:val="bullet"/>
+      <w:lvlText w:val=""/>
+      <w:lvlJc w:val="start"/>
+      <w:pPr>
+        <w:tabs>
+          <w:tab w:val="num" w:pos="4963"/>
+        </w:tabs>
+        <w:ind w:start="4963" w:hanging="283"/>
+      </w:pPr>
+      <w:rPr>
+        <w:rFonts w:ascii="Symbol" w:hAnsi="Symbol" w:cs="Symbol" w:hint="default"/>
+      </w:rPr>
+    </w:lvl>
+    <w:lvl w:ilvl="7">
+      <w:start w:val="1"/>
+      <w:numFmt w:val="bullet"/>
+      <w:lvlText w:val=""/>
+      <w:lvlJc w:val="start"/>
+      <w:pPr>
+        <w:tabs>
+          <w:tab w:val="num" w:pos="5672"/>
+        </w:tabs>
+        <w:ind w:start="5672" w:hanging="283"/>
+      </w:pPr>
+      <w:rPr>
+        <w:rFonts w:ascii="Symbol" w:hAnsi="Symbol" w:cs="Symbol" w:hint="default"/>
+      </w:rPr>
+    </w:lvl>
+    <w:lvl w:ilvl="8">
+      <w:start w:val="1"/>
+      <w:numFmt w:val="bullet"/>
+      <w:lvlText w:val=""/>
+      <w:lvlJc w:val="start"/>
+      <w:pPr>
+        <w:tabs>
+          <w:tab w:val="num" w:pos="6381"/>
+        </w:tabs>
+        <w:ind w:start="6381" w:hanging="283"/>
+      </w:pPr>
+      <w:rPr>
+        <w:rFonts w:ascii="Symbol" w:hAnsi="Symbol" w:cs="Symbol" w:hint="default"/>
+      </w:rPr>
+    </w:lvl>
+  </w:abstractNum>
+  <w:abstractNum w:abstractNumId="6">
+    <w:lvl w:ilvl="0">
+      <w:start w:val="1"/>
+      <w:numFmt w:val="decimal"/>
+      <w:lvlText w:val="%1."/>
+      <w:lvlJc w:val="start"/>
+      <w:pPr>
+        <w:tabs>
+          <w:tab w:val="num" w:pos="709"/>
+        </w:tabs>
+        <w:ind w:start="709" w:hanging="283"/>
+      </w:pPr>
+      <w:rPr/>
+    </w:lvl>
+    <w:lvl w:ilvl="1">
+      <w:start w:val="1"/>
+      <w:numFmt w:val="decimal"/>
+      <w:lvlText w:val="%2."/>
+      <w:lvlJc w:val="start"/>
+      <w:pPr>
+        <w:tabs>
+          <w:tab w:val="num" w:pos="1418"/>
+        </w:tabs>
+        <w:ind w:start="1418" w:hanging="283"/>
+      </w:pPr>
+      <w:rPr/>
+    </w:lvl>
+    <w:lvl w:ilvl="2">
+      <w:start w:val="1"/>
+      <w:numFmt w:val="decimal"/>
+      <w:lvlText w:val="%3."/>
+      <w:lvlJc w:val="start"/>
+      <w:pPr>
+        <w:tabs>
+          <w:tab w:val="num" w:pos="2127"/>
+        </w:tabs>
+        <w:ind w:start="2127" w:hanging="283"/>
+      </w:pPr>
+      <w:rPr/>
+    </w:lvl>
+    <w:lvl w:ilvl="3">
+      <w:start w:val="1"/>
+      <w:numFmt w:val="decimal"/>
+      <w:lvlText w:val="%4."/>
+      <w:lvlJc w:val="start"/>
+      <w:pPr>
+        <w:tabs>
+          <w:tab w:val="num" w:pos="2836"/>
+        </w:tabs>
+        <w:ind w:start="2836" w:hanging="283"/>
+      </w:pPr>
+      <w:rPr/>
+    </w:lvl>
+    <w:lvl w:ilvl="4">
+      <w:start w:val="1"/>
+      <w:numFmt w:val="decimal"/>
+      <w:lvlText w:val="%5."/>
+      <w:lvlJc w:val="start"/>
+      <w:pPr>
+        <w:tabs>
+          <w:tab w:val="num" w:pos="3545"/>
+        </w:tabs>
+        <w:ind w:start="3545" w:hanging="283"/>
+      </w:pPr>
+      <w:rPr/>
+    </w:lvl>
+    <w:lvl w:ilvl="5">
+      <w:start w:val="1"/>
+      <w:numFmt w:val="decimal"/>
+      <w:lvlText w:val="%6."/>
+      <w:lvlJc w:val="start"/>
+      <w:pPr>
+        <w:tabs>
+          <w:tab w:val="num" w:pos="4254"/>
+        </w:tabs>
+        <w:ind w:start="4254" w:hanging="283"/>
+      </w:pPr>
+      <w:rPr/>
+    </w:lvl>
+    <w:lvl w:ilvl="6">
+      <w:start w:val="1"/>
+      <w:numFmt w:val="decimal"/>
+      <w:lvlText w:val="%7."/>
+      <w:lvlJc w:val="start"/>
+      <w:pPr>
+        <w:tabs>
+          <w:tab w:val="num" w:pos="4963"/>
+        </w:tabs>
+        <w:ind w:start="4963" w:hanging="283"/>
+      </w:pPr>
+      <w:rPr/>
+    </w:lvl>
+    <w:lvl w:ilvl="7">
+      <w:start w:val="1"/>
+      <w:numFmt w:val="decimal"/>
+      <w:lvlText w:val="%8."/>
+      <w:lvlJc w:val="start"/>
+      <w:pPr>
+        <w:tabs>
+          <w:tab w:val="num" w:pos="5672"/>
+        </w:tabs>
+        <w:ind w:start="5672" w:hanging="283"/>
+      </w:pPr>
+      <w:rPr/>
+    </w:lvl>
+    <w:lvl w:ilvl="8">
+      <w:start w:val="1"/>
+      <w:numFmt w:val="decimal"/>
+      <w:lvlText w:val="%9."/>
+      <w:lvlJc w:val="start"/>
+      <w:pPr>
+        <w:tabs>
+          <w:tab w:val="num" w:pos="6381"/>
+        </w:tabs>
+        <w:ind w:start="6381" w:hanging="283"/>
+      </w:pPr>
+      <w:rPr/>
+    </w:lvl>
+  </w:abstractNum>
+  <w:abstractNum w:abstractNumId="7">
+    <w:lvl w:ilvl="0">
+      <w:start w:val="1"/>
+      <w:numFmt w:val="decimal"/>
+      <w:lvlText w:val="%1."/>
+      <w:lvlJc w:val="start"/>
+      <w:pPr>
+        <w:tabs>
+          <w:tab w:val="num" w:pos="709"/>
+        </w:tabs>
+        <w:ind w:start="709" w:hanging="283"/>
+      </w:pPr>
+      <w:rPr/>
+    </w:lvl>
+    <w:lvl w:ilvl="1">
+      <w:start w:val="1"/>
+      <w:numFmt w:val="bullet"/>
+      <w:lvlText w:val=""/>
+      <w:lvlJc w:val="start"/>
+      <w:pPr>
+        <w:tabs>
+          <w:tab w:val="num" w:pos="1418"/>
+        </w:tabs>
+        <w:ind w:start="1418" w:hanging="283"/>
+      </w:pPr>
+      <w:rPr>
+        <w:rFonts w:ascii="Symbol" w:hAnsi="Symbol" w:cs="Symbol" w:hint="default"/>
+      </w:rPr>
+    </w:lvl>
+    <w:lvl w:ilvl="2">
+      <w:start w:val="1"/>
+      <w:numFmt w:val="bullet"/>
+      <w:lvlText w:val=""/>
+      <w:lvlJc w:val="start"/>
+      <w:pPr>
+        <w:tabs>
+          <w:tab w:val="num" w:pos="2127"/>
+        </w:tabs>
+        <w:ind w:start="2127" w:hanging="283"/>
+      </w:pPr>
+      <w:rPr>
+        <w:rFonts w:ascii="Symbol" w:hAnsi="Symbol" w:cs="Symbol" w:hint="default"/>
+      </w:rPr>
+    </w:lvl>
+    <w:lvl w:ilvl="3">
+      <w:start w:val="1"/>
+      <w:numFmt w:val="bullet"/>
+      <w:lvlText w:val=""/>
+      <w:lvlJc w:val="start"/>
+      <w:pPr>
+        <w:tabs>
+          <w:tab w:val="num" w:pos="2836"/>
+        </w:tabs>
+        <w:ind w:start="2836" w:hanging="283"/>
+      </w:pPr>
+      <w:rPr>
+        <w:rFonts w:ascii="Symbol" w:hAnsi="Symbol" w:cs="Symbol" w:hint="default"/>
+      </w:rPr>
+    </w:lvl>
+    <w:lvl w:ilvl="4">
+      <w:start w:val="1"/>
+      <w:numFmt w:val="bullet"/>
+      <w:lvlText w:val=""/>
+      <w:lvlJc w:val="start"/>
+      <w:pPr>
+        <w:tabs>
+          <w:tab w:val="num" w:pos="3545"/>
+        </w:tabs>
+        <w:ind w:start="3545" w:hanging="283"/>
+      </w:pPr>
+      <w:rPr>
+        <w:rFonts w:ascii="Symbol" w:hAnsi="Symbol" w:cs="Symbol" w:hint="default"/>
+      </w:rPr>
+    </w:lvl>
+    <w:lvl w:ilvl="5">
+      <w:start w:val="1"/>
+      <w:numFmt w:val="bullet"/>
+      <w:lvlText w:val=""/>
+      <w:lvlJc w:val="start"/>
+      <w:pPr>
+        <w:tabs>
+          <w:tab w:val="num" w:pos="4254"/>
+        </w:tabs>
+        <w:ind w:start="4254" w:hanging="283"/>
+      </w:pPr>
+      <w:rPr>
+        <w:rFonts w:ascii="Symbol" w:hAnsi="Symbol" w:cs="Symbol" w:hint="default"/>
+      </w:rPr>
+    </w:lvl>
+    <w:lvl w:ilvl="6">
+      <w:start w:val="1"/>
+      <w:numFmt w:val="bullet"/>
+      <w:lvlText w:val=""/>
+      <w:lvlJc w:val="start"/>
+      <w:pPr>
+        <w:tabs>
+          <w:tab w:val="num" w:pos="4963"/>
+        </w:tabs>
+        <w:ind w:start="4963" w:hanging="283"/>
+      </w:pPr>
+      <w:rPr>
+        <w:rFonts w:ascii="Symbol" w:hAnsi="Symbol" w:cs="Symbol" w:hint="default"/>
+      </w:rPr>
+    </w:lvl>
+    <w:lvl w:ilvl="7">
+      <w:start w:val="1"/>
+      <w:numFmt w:val="bullet"/>
+      <w:lvlText w:val=""/>
+      <w:lvlJc w:val="start"/>
+      <w:pPr>
+        <w:tabs>
+          <w:tab w:val="num" w:pos="5672"/>
+        </w:tabs>
+        <w:ind w:start="5672" w:hanging="283"/>
+      </w:pPr>
+      <w:rPr>
+        <w:rFonts w:ascii="Symbol" w:hAnsi="Symbol" w:cs="Symbol" w:hint="default"/>
+      </w:rPr>
+    </w:lvl>
+    <w:lvl w:ilvl="8">
+      <w:start w:val="1"/>
+      <w:numFmt w:val="bullet"/>
+      <w:lvlText w:val=""/>
+      <w:lvlJc w:val="start"/>
+      <w:pPr>
+        <w:tabs>
+          <w:tab w:val="num" w:pos="6381"/>
+        </w:tabs>
+        <w:ind w:start="6381" w:hanging="283"/>
+      </w:pPr>
+      <w:rPr>
+        <w:rFonts w:ascii="Symbol" w:hAnsi="Symbol" w:cs="Symbol" w:hint="default"/>
+      </w:rPr>
+    </w:lvl>
+  </w:abstractNum>
+  <w:abstractNum w:abstractNumId="8">
+    <w:lvl w:ilvl="0">
+      <w:start w:val="1"/>
+      <w:numFmt w:val="bullet"/>
+      <w:lvlText w:val=""/>
+      <w:lvlJc w:val="start"/>
+      <w:pPr>
+        <w:tabs>
+          <w:tab w:val="num" w:pos="709"/>
+        </w:tabs>
+        <w:ind w:start="709" w:hanging="283"/>
+      </w:pPr>
+      <w:rPr>
+        <w:rFonts w:ascii="Symbol" w:hAnsi="Symbol" w:cs="Symbol" w:hint="default"/>
+      </w:rPr>
+    </w:lvl>
+    <w:lvl w:ilvl="1">
+      <w:start w:val="1"/>
+      <w:numFmt w:val="bullet"/>
+      <w:lvlText w:val=""/>
+      <w:lvlJc w:val="start"/>
+      <w:pPr>
+        <w:tabs>
+          <w:tab w:val="num" w:pos="1418"/>
+        </w:tabs>
+        <w:ind w:start="1418" w:hanging="283"/>
+      </w:pPr>
+      <w:rPr>
+        <w:rFonts w:ascii="Symbol" w:hAnsi="Symbol" w:cs="Symbol" w:hint="default"/>
+      </w:rPr>
+    </w:lvl>
+    <w:lvl w:ilvl="2">
+      <w:start w:val="1"/>
+      <w:numFmt w:val="bullet"/>
+      <w:lvlText w:val=""/>
+      <w:lvlJc w:val="start"/>
+      <w:pPr>
+        <w:tabs>
+          <w:tab w:val="num" w:pos="2127"/>
+        </w:tabs>
+        <w:ind w:start="2127" w:hanging="283"/>
+      </w:pPr>
+      <w:rPr>
+        <w:rFonts w:ascii="Symbol" w:hAnsi="Symbol" w:cs="Symbol" w:hint="default"/>
+      </w:rPr>
+    </w:lvl>
+    <w:lvl w:ilvl="3">
+      <w:start w:val="1"/>
+      <w:numFmt w:val="bullet"/>
+      <w:lvlText w:val=""/>
+      <w:lvlJc w:val="start"/>
+      <w:pPr>
+        <w:tabs>
+          <w:tab w:val="num" w:pos="2836"/>
+        </w:tabs>
+        <w:ind w:start="2836" w:hanging="283"/>
+      </w:pPr>
+      <w:rPr>
+        <w:rFonts w:ascii="Symbol" w:hAnsi="Symbol" w:cs="Symbol" w:hint="default"/>
+      </w:rPr>
+    </w:lvl>
+    <w:lvl w:ilvl="4">
+      <w:start w:val="1"/>
+      <w:numFmt w:val="bullet"/>
+      <w:lvlText w:val=""/>
+      <w:lvlJc w:val="start"/>
+      <w:pPr>
+        <w:tabs>
+          <w:tab w:val="num" w:pos="3545"/>
+        </w:tabs>
+        <w:ind w:start="3545" w:hanging="283"/>
+      </w:pPr>
+      <w:rPr>
+        <w:rFonts w:ascii="Symbol" w:hAnsi="Symbol" w:cs="Symbol" w:hint="default"/>
+      </w:rPr>
+    </w:lvl>
+    <w:lvl w:ilvl="5">
+      <w:start w:val="1"/>
+      <w:numFmt w:val="bullet"/>
+      <w:lvlText w:val=""/>
+      <w:lvlJc w:val="start"/>
+      <w:pPr>
+        <w:tabs>
+          <w:tab w:val="num" w:pos="4254"/>
+        </w:tabs>
+        <w:ind w:start="4254" w:hanging="283"/>
+      </w:pPr>
+      <w:rPr>
+        <w:rFonts w:ascii="Symbol" w:hAnsi="Symbol" w:cs="Symbol" w:hint="default"/>
+      </w:rPr>
+    </w:lvl>
+    <w:lvl w:ilvl="6">
+      <w:start w:val="1"/>
+      <w:numFmt w:val="bullet"/>
+      <w:lvlText w:val=""/>
+      <w:lvlJc w:val="start"/>
+      <w:pPr>
+        <w:tabs>
+          <w:tab w:val="num" w:pos="4963"/>
+        </w:tabs>
+        <w:ind w:start="4963" w:hanging="283"/>
+      </w:pPr>
+      <w:rPr>
+        <w:rFonts w:ascii="Symbol" w:hAnsi="Symbol" w:cs="Symbol" w:hint="default"/>
+      </w:rPr>
+    </w:lvl>
+    <w:lvl w:ilvl="7">
+      <w:start w:val="1"/>
+      <w:numFmt w:val="bullet"/>
+      <w:lvlText w:val=""/>
+      <w:lvlJc w:val="start"/>
+      <w:pPr>
+        <w:tabs>
+          <w:tab w:val="num" w:pos="5672"/>
+        </w:tabs>
+        <w:ind w:start="5672" w:hanging="283"/>
+      </w:pPr>
+      <w:rPr>
+        <w:rFonts w:ascii="Symbol" w:hAnsi="Symbol" w:cs="Symbol" w:hint="default"/>
+      </w:rPr>
+    </w:lvl>
+    <w:lvl w:ilvl="8">
+      <w:start w:val="1"/>
+      <w:numFmt w:val="bullet"/>
+      <w:lvlText w:val=""/>
+      <w:lvlJc w:val="start"/>
+      <w:pPr>
+        <w:tabs>
+          <w:tab w:val="num" w:pos="6381"/>
+        </w:tabs>
+        <w:ind w:start="6381" w:hanging="283"/>
+      </w:pPr>
+      <w:rPr>
+        <w:rFonts w:ascii="Symbol" w:hAnsi="Symbol" w:cs="Symbol" w:hint="default"/>
+      </w:rPr>
+    </w:lvl>
+  </w:abstractNum>
+  <w:abstractNum w:abstractNumId="9">
+    <w:lvl w:ilvl="0">
+      <w:start w:val="1"/>
       <w:numFmt w:val="none"/>
       <w:suff w:val="nothing"/>
       <w:lvlText w:val=""/>
@@ -1463,6 +2624,7 @@
     </w:lvl>
     <w:lvl w:ilvl="1">
       <w:start w:val="1"/>
+      <w:pStyle w:val="Heading2"/>
       <w:numFmt w:val="none"/>
       <w:suff w:val="nothing"/>
       <w:lvlText w:val=""/>
@@ -1476,7 +2638,6 @@
     </w:lvl>
     <w:lvl w:ilvl="2">
       <w:start w:val="1"/>
-      <w:pStyle w:val="Heading3"/>
       <w:numFmt w:val="none"/>
       <w:suff w:val="nothing"/>
       <w:lvlText w:val=""/>
@@ -1582,6 +2743,18 @@
   <w:num w:numId="5">
     <w:abstractNumId w:val="5"/>
   </w:num>
+  <w:num w:numId="6">
+    <w:abstractNumId w:val="6"/>
+  </w:num>
+  <w:num w:numId="7">
+    <w:abstractNumId w:val="7"/>
+  </w:num>
+  <w:num w:numId="8">
+    <w:abstractNumId w:val="8"/>
+  </w:num>
+  <w:num w:numId="9">
+    <w:abstractNumId w:val="9"/>
+  </w:num>
 </w:numbering>
 </file>
 
@@ -1599,7 +2772,6 @@
     </w:rPrDefault>
     <w:pPrDefault>
       <w:pPr>
-        <w:widowControl/>
         <w:suppressAutoHyphens w:val="true"/>
       </w:pPr>
     </w:pPrDefault>
@@ -1609,7 +2781,10 @@
     <w:qFormat/>
     <w:pPr>
       <w:widowControl/>
+      <w:suppressAutoHyphens w:val="true"/>
       <w:bidi w:val="0"/>
+      <w:spacing w:before="0" w:after="0"/>
+      <w:jc w:val="start"/>
     </w:pPr>
     <w:rPr>
       <w:rFonts w:ascii="Liberation Serif" w:hAnsi="Liberation Serif" w:eastAsia="Noto Serif CJK SC" w:cs="FreeSans"/>
@@ -1618,6 +2793,23 @@
       <w:sz w:val="24"/>
       <w:szCs w:val="24"/>
       <w:lang w:val="es-ES" w:eastAsia="zh-CN" w:bidi="hi-IN"/>
+    </w:rPr>
+  </w:style>
+  <w:style w:type="paragraph" w:styleId="Heading2">
+    <w:name w:val="Heading 2"/>
+    <w:basedOn w:val="Ttulo"/>
+    <w:next w:val="BodyText"/>
+    <w:qFormat/>
+    <w:pPr>
+      <w:spacing w:before="200" w:after="120"/>
+      <w:outlineLvl w:val="1"/>
+    </w:pPr>
+    <w:rPr>
+      <w:rFonts w:ascii="Liberation Serif" w:hAnsi="Liberation Serif" w:eastAsia="Noto Serif CJK SC" w:cs="FreeSans"/>
+      <w:b/>
+      <w:bCs/>
+      <w:sz w:val="36"/>
+      <w:szCs w:val="36"/>
     </w:rPr>
   </w:style>
   <w:style w:type="paragraph" w:styleId="Heading3">

</xml_diff>